<commit_message>
Manuscript: consent is taken at reception, refusal is handled on the recorder
New paragraph in the trigger section. Because recording starts without
clinician action, consent is obtained at reception and no consent
attribute is required of the partner record system. A patient who
declines is honoured through the on-screen stop control: acquisition
stops on the key press, and the encounter's segments and clinical record
are erased everywhere, leaving only an audit entry with no audio and no
patient identifiers.

The opening now mentions the stop-and-pause control, which the tray-only
description had left out.
</commit_message>
<xml_diff>
--- a/manuscript/AIMScribe_Software_Architecture_Section.docx
+++ b/manuscript/AIMScribe_Software_Architecture_Section.docx
@@ -33,7 +33,7 @@
         <w:t>aimscribe.exe</w:t>
       </w:r>
       <w:r>
-        <w:t>, is a lightweight edge daemon presented to the clinician only as a system-tray icon. Acquisition, segmentation and transmission run on independent threads and an asynchronous transport loop, so that disk and network latency cannot propagate back into the audio path. This separation is a deployment requirement, not an optimisation: the study sites run legacy, lower-specification workstations on which any blocking operation would degrade the electronic health record (EHR) in active use. Audio is acquired as linear PCM at the capture device's native sample rate, with operating-system resampling and channel down-mixing excluded from the path, at a sustained 88.2 kB s⁻¹.</w:t>
+        <w:t>, is a lightweight edge daemon presented to the clinician only as a system-tray icon and, during recording, a minimal stop-and-pause control. Acquisition, segmentation and transmission run on independent threads and an asynchronous transport loop, so that disk and network latency cannot propagate back into the audio path. This separation is a deployment requirement, not an optimisation: the study sites run legacy, lower-specification workstations on which any blocking operation would degrade the electronic health record (EHR) in active use. Audio is acquired as linear PCM at the capture device's native sample rate, with operating-system resampling and channel down-mixing excluded from the path, at a sustained 88.2 kB s⁻¹.</w:t>
       </w:r>
     </w:p>
     <w:p>
@@ -118,6 +118,14 @@
       </w:pPr>
       <w:r>
         <w:t>Acquisition imposes no interface burden on the consultation. Requiring a clinician to start and stop a recorder introduces cognitive load when attention is owed to the patient, and such controls are reliably forgotten. The trigger is therefore derived from an action already performed: an EHR interface event, the selection of patient details, dispatches a signal over the loopback channel to the local daemon, and background capture begins. Authorisation is obtained from the backend in parallel with acquisition rather than before it. Transient network latency thus cannot displace the opening seconds of the encounter, in which the presenting complaint is typically stated.</w:t>
+      </w:r>
+    </w:p>
+    <w:p>
+      <w:pPr>
+        <w:jc w:val="both"/>
+      </w:pPr>
+      <w:r>
+        <w:t>Because acquisition begins without clinician action, consent is handled outside the recording path and refusal within it. Consent is obtained at reception under each clinic's existing procedure, and no consent attribute is required of the partner record system. A patient may nonetheless decline at any point in the encounter. The clinician then activates a persistent on-screen stop control and selects non-consent as the reason; acquisition ceases on the key press, before the reason is confirmed. The encounter's segments are then erased from the workstation, from object storage and from the backend, together with any clinical record received for that visit. This is the only sanctioned deletion path, and it leaves solely an audit entry containing neither audio nor patient identifiers.</w:t>
       </w:r>
     </w:p>
     <w:p>

</xml_diff>